<commit_message>
adjust margin in answer template address boxes
</commit_message>
<xml_diff>
--- a/docassemble/MLHDivorceAndCustody/data/templates/answer_to_complaint_for_divorce_cc_409.docx
+++ b/docassemble/MLHDivorceAndCustody/data/templates/answer_to_complaint_for_divorce_cc_409.docx
@@ -291,7 +291,7 @@
         <mc:AlternateContent>
           <mc:Choice Requires="wps">
             <w:drawing>
-              <wp:anchor distT="0" distB="0" distL="0" distR="0" simplePos="0" relativeHeight="15731712" behindDoc="0" locked="0" layoutInCell="1" allowOverlap="1" wp14:anchorId="0BA24F26" wp14:editId="6CC327DD">
+              <wp:anchor distT="0" distB="0" distL="0" distR="0" simplePos="0" relativeHeight="15731712" behindDoc="0" locked="0" layoutInCell="1" allowOverlap="1" wp14:anchorId="0BA24F26" wp14:editId="3770A364">
                 <wp:simplePos x="0" y="0"/>
                 <wp:positionH relativeFrom="page">
                   <wp:posOffset>4041775</wp:posOffset>
@@ -300,7 +300,7 @@
                   <wp:posOffset>-393688</wp:posOffset>
                 </wp:positionV>
                 <wp:extent cx="3276600" cy="914400"/>
-                <wp:effectExtent l="0" t="0" r="0" b="0"/>
+                <wp:effectExtent l="0" t="0" r="19050" b="19050"/>
                 <wp:wrapNone/>
                 <wp:docPr id="1" name="Textbox 1"/>
                 <wp:cNvGraphicFramePr>
@@ -691,7 +691,7 @@
                           </w:p>
                         </w:txbxContent>
                       </wps:txbx>
-                      <wps:bodyPr wrap="square" lIns="0" tIns="0" rIns="0" bIns="0" rtlCol="0">
+                      <wps:bodyPr wrap="square" lIns="0" tIns="45720" rIns="0" bIns="0" rtlCol="0">
                         <a:noAutofit/>
                       </wps:bodyPr>
                     </wps:wsp>
@@ -706,9 +706,9 @@
                 <v:stroke joinstyle="miter"/>
                 <v:path gradientshapeok="t" o:connecttype="rect"/>
               </v:shapetype>
-              <v:shape id="Textbox 1" o:spid="_x0000_s1026" type="#_x0000_t202" style="position:absolute;left:0;text-align:left;margin-left:318.25pt;margin-top:-31pt;width:258pt;height:1in;z-index:15731712;visibility:visible;mso-wrap-style:square;mso-wrap-distance-left:0;mso-wrap-distance-top:0;mso-wrap-distance-right:0;mso-wrap-distance-bottom:0;mso-position-horizontal:absolute;mso-position-horizontal-relative:page;mso-position-vertical:absolute;mso-position-vertical-relative:text;v-text-anchor:top" o:gfxdata="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" filled="f" strokecolor="#231f20" strokeweight=".5pt">
+              <v:shape id="Textbox 1" o:spid="_x0000_s1026" type="#_x0000_t202" style="position:absolute;left:0;text-align:left;margin-left:318.25pt;margin-top:-31pt;width:258pt;height:1in;z-index:15731712;visibility:visible;mso-wrap-style:square;mso-wrap-distance-left:0;mso-wrap-distance-top:0;mso-wrap-distance-right:0;mso-wrap-distance-bottom:0;mso-position-horizontal:absolute;mso-position-horizontal-relative:page;mso-position-vertical:absolute;mso-position-vertical-relative:text;v-text-anchor:top" o:gfxdata="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" filled="f" strokecolor="#231f20" strokeweight=".5pt">
                 <v:path arrowok="t"/>
-                <v:textbox inset="0,0,0,0">
+                <v:textbox inset="0,,0,0">
                   <w:txbxContent>
                     <w:p>
                       <w:pPr>
@@ -1085,7 +1085,7 @@
         <mc:AlternateContent>
           <mc:Choice Requires="wps">
             <w:drawing>
-              <wp:anchor distT="0" distB="0" distL="0" distR="0" simplePos="0" relativeHeight="15732224" behindDoc="0" locked="0" layoutInCell="1" allowOverlap="1" wp14:anchorId="15DD38EE" wp14:editId="62DDCED0">
+              <wp:anchor distT="0" distB="0" distL="0" distR="0" simplePos="0" relativeHeight="15732224" behindDoc="0" locked="0" layoutInCell="1" allowOverlap="1" wp14:anchorId="15DD38EE" wp14:editId="0108534F">
                 <wp:simplePos x="0" y="0"/>
                 <wp:positionH relativeFrom="page">
                   <wp:posOffset>460375</wp:posOffset>
@@ -1094,7 +1094,7 @@
                   <wp:posOffset>-393688</wp:posOffset>
                 </wp:positionV>
                 <wp:extent cx="3276600" cy="914400"/>
-                <wp:effectExtent l="0" t="0" r="0" b="0"/>
+                <wp:effectExtent l="0" t="0" r="19050" b="19050"/>
                 <wp:wrapNone/>
                 <wp:docPr id="2" name="Textbox 2"/>
                 <wp:cNvGraphicFramePr>
@@ -1547,20 +1547,23 @@
                           </w:p>
                         </w:txbxContent>
                       </wps:txbx>
-                      <wps:bodyPr wrap="square" lIns="0" tIns="0" rIns="0" bIns="0" rtlCol="0">
+                      <wps:bodyPr wrap="square" lIns="0" tIns="45720" rIns="0" bIns="0" rtlCol="0">
                         <a:noAutofit/>
                       </wps:bodyPr>
                     </wps:wsp>
                   </a:graphicData>
                 </a:graphic>
+                <wp14:sizeRelV relativeFrom="margin">
+                  <wp14:pctHeight>0</wp14:pctHeight>
+                </wp14:sizeRelV>
               </wp:anchor>
             </w:drawing>
           </mc:Choice>
           <mc:Fallback>
             <w:pict>
-              <v:shape w14:anchorId="15DD38EE" id="Textbox 2" o:spid="_x0000_s1027" type="#_x0000_t202" style="position:absolute;left:0;text-align:left;margin-left:36.25pt;margin-top:-31pt;width:258pt;height:1in;z-index:15732224;visibility:visible;mso-wrap-style:square;mso-wrap-distance-left:0;mso-wrap-distance-top:0;mso-wrap-distance-right:0;mso-wrap-distance-bottom:0;mso-position-horizontal:absolute;mso-position-horizontal-relative:page;mso-position-vertical:absolute;mso-position-vertical-relative:text;v-text-anchor:top" o:gfxdata="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" filled="f" strokecolor="#231f20" strokeweight=".5pt">
+              <v:shape w14:anchorId="15DD38EE" id="Textbox 2" o:spid="_x0000_s1027" type="#_x0000_t202" style="position:absolute;left:0;text-align:left;margin-left:36.25pt;margin-top:-31pt;width:258pt;height:1in;z-index:15732224;visibility:visible;mso-wrap-style:square;mso-height-percent:0;mso-wrap-distance-left:0;mso-wrap-distance-top:0;mso-wrap-distance-right:0;mso-wrap-distance-bottom:0;mso-position-horizontal:absolute;mso-position-horizontal-relative:page;mso-position-vertical:absolute;mso-position-vertical-relative:text;mso-height-percent:0;mso-height-relative:margin;v-text-anchor:top" o:gfxdata="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" filled="f" strokecolor="#231f20" strokeweight=".5pt">
                 <v:path arrowok="t"/>
-                <v:textbox inset="0,0,0,0">
+                <v:textbox inset="0,,0,0">
                   <w:txbxContent>
                     <w:p>
                       <w:pPr>
@@ -2355,8 +2358,13 @@
       <w:proofErr w:type="spellEnd"/>
       <w:proofErr w:type="gramEnd"/>
       <w:r>
-        <w:t xml:space="preserve"> == "agree" %}</w:t>
-      </w:r>
+        <w:t xml:space="preserve"> == "agree</w:t>
+      </w:r>
+      <w:proofErr w:type="gramStart"/>
+      <w:r>
+        <w:t>" %}</w:t>
+      </w:r>
+      <w:proofErr w:type="gramEnd"/>
     </w:p>
     <w:p>
       <w:pPr>
@@ -2455,8 +2463,13 @@
       </w:r>
       <w:proofErr w:type="gramEnd"/>
       <w:r>
-        <w:t>% endif %}</w:t>
-      </w:r>
+        <w:t xml:space="preserve">% </w:t>
+      </w:r>
+      <w:proofErr w:type="gramStart"/>
+      <w:r>
+        <w:t>endif %}</w:t>
+      </w:r>
+      <w:proofErr w:type="gramEnd"/>
     </w:p>
     <w:p>
       <w:pPr>
@@ -2491,8 +2504,13 @@
       <w:proofErr w:type="spellEnd"/>
       <w:proofErr w:type="gramEnd"/>
       <w:r>
-        <w:t xml:space="preserve"> == "disagree" %}</w:t>
-      </w:r>
+        <w:t xml:space="preserve"> == "disagree</w:t>
+      </w:r>
+      <w:proofErr w:type="gramStart"/>
+      <w:r>
+        <w:t>" %}</w:t>
+      </w:r>
+      <w:proofErr w:type="gramEnd"/>
     </w:p>
     <w:p>
       <w:pPr>
@@ -2588,8 +2606,13 @@
       </w:r>
       <w:proofErr w:type="gramEnd"/>
       <w:r>
-        <w:t>% endif %}</w:t>
-      </w:r>
+        <w:t xml:space="preserve">% </w:t>
+      </w:r>
+      <w:proofErr w:type="gramStart"/>
+      <w:r>
+        <w:t>endif %}</w:t>
+      </w:r>
+      <w:proofErr w:type="gramEnd"/>
     </w:p>
     <w:p>
       <w:pPr>
@@ -2624,8 +2647,13 @@
       <w:proofErr w:type="spellEnd"/>
       <w:proofErr w:type="gramEnd"/>
       <w:r>
-        <w:t xml:space="preserve"> == "unsure" %}</w:t>
-      </w:r>
+        <w:t xml:space="preserve"> == "unsure</w:t>
+      </w:r>
+      <w:proofErr w:type="gramStart"/>
+      <w:r>
+        <w:t>" %}</w:t>
+      </w:r>
+      <w:proofErr w:type="gramEnd"/>
     </w:p>
     <w:p>
       <w:pPr>
@@ -2721,8 +2749,13 @@
       </w:r>
       <w:proofErr w:type="gramEnd"/>
       <w:r>
-        <w:t>% endif %}</w:t>
-      </w:r>
+        <w:t xml:space="preserve">% </w:t>
+      </w:r>
+      <w:proofErr w:type="gramStart"/>
+      <w:r>
+        <w:t>endif %}</w:t>
+      </w:r>
+      <w:proofErr w:type="gramEnd"/>
     </w:p>
     <w:p>
       <w:pPr>
@@ -3344,7 +3377,7 @@
           </mc:Choice>
           <mc:Fallback>
             <w:pict>
-              <v:shape w14:anchorId="283A43EF" id="Textbox 6" o:spid="_x0000_s1028" type="#_x0000_t202" style="position:absolute;margin-left:239.25pt;margin-top:15.4pt;width:133.55pt;height:13.8pt;z-index:-15727616;visibility:visible;mso-wrap-style:square;mso-wrap-distance-left:0;mso-wrap-distance-top:0;mso-wrap-distance-right:0;mso-wrap-distance-bottom:0;mso-position-horizontal:absolute;mso-position-horizontal-relative:page;mso-position-vertical:absolute;mso-position-vertical-relative:text;v-text-anchor:top" o:gfxdata="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" filled="f" strokecolor="#231f20" strokeweight=".5pt">
+              <v:shape w14:anchorId="283A43EF" id="Textbox 6" o:spid="_x0000_s1028" type="#_x0000_t202" style="position:absolute;margin-left:239.25pt;margin-top:15.4pt;width:133.55pt;height:13.8pt;z-index:-15727616;visibility:visible;mso-wrap-style:square;mso-wrap-distance-left:0;mso-wrap-distance-top:0;mso-wrap-distance-right:0;mso-wrap-distance-bottom:0;mso-position-horizontal:absolute;mso-position-horizontal-relative:page;mso-position-vertical:absolute;mso-position-vertical-relative:text;v-text-anchor:top" o:gfxdata="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" filled="f" strokecolor="#231f20" strokeweight=".5pt">
                 <v:path arrowok="t"/>
                 <v:textbox inset="0,0,0,0">
                   <w:txbxContent>
@@ -3777,7 +3810,7 @@
           </mc:Choice>
           <mc:Fallback>
             <w:pict>
-              <v:shape w14:anchorId="72AD9F7C" id="Graphic 7" o:spid="_x0000_s1026" style="position:absolute;margin-left:36pt;margin-top:22.3pt;width:120pt;height:.1pt;z-index:-15727104;visibility:visible;mso-wrap-style:square;mso-wrap-distance-left:0;mso-wrap-distance-top:0;mso-wrap-distance-right:0;mso-wrap-distance-bottom:0;mso-position-horizontal:absolute;mso-position-horizontal-relative:page;mso-position-vertical:absolute;mso-position-vertical-relative:text;v-text-anchor:top" coordsize="1524000,1270" o:gfxdata="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" path="m,l1524000,e" filled="f" strokecolor="#231f20" strokeweight=".5pt">
+              <v:shape w14:anchorId="72AD9F7C" id="Graphic 7" o:spid="_x0000_s1026" style="position:absolute;margin-left:36pt;margin-top:22.3pt;width:120pt;height:.1pt;z-index:-15727104;visibility:visible;mso-wrap-style:square;mso-wrap-distance-left:0;mso-wrap-distance-top:0;mso-wrap-distance-right:0;mso-wrap-distance-bottom:0;mso-position-horizontal:absolute;mso-position-horizontal-relative:page;mso-position-vertical:absolute;mso-position-vertical-relative:text;v-text-anchor:top" coordsize="1524000,1270" o:gfxdata="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" path="m,l1524000,e" filled="f" strokecolor="#231f20" strokeweight=".5pt">
                 <v:path arrowok="t"/>
                 <w10:wrap type="topAndBottom" anchorx="page"/>
               </v:shape>
@@ -3856,7 +3889,7 @@
           </mc:Choice>
           <mc:Fallback>
             <w:pict>
-              <v:shape w14:anchorId="0ABD838F" id="Graphic 8" o:spid="_x0000_s1026" style="position:absolute;margin-left:306pt;margin-top:22.3pt;width:270pt;height:.1pt;z-index:-15726592;visibility:visible;mso-wrap-style:square;mso-wrap-distance-left:0;mso-wrap-distance-top:0;mso-wrap-distance-right:0;mso-wrap-distance-bottom:0;mso-position-horizontal:absolute;mso-position-horizontal-relative:page;mso-position-vertical:absolute;mso-position-vertical-relative:text;v-text-anchor:top" coordsize="3429000,1270" o:gfxdata="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" path="m,l3429000,e" filled="f" strokecolor="#231f20" strokeweight=".5pt">
+              <v:shape w14:anchorId="0ABD838F" id="Graphic 8" o:spid="_x0000_s1026" style="position:absolute;margin-left:306pt;margin-top:22.3pt;width:270pt;height:.1pt;z-index:-15726592;visibility:visible;mso-wrap-style:square;mso-wrap-distance-left:0;mso-wrap-distance-top:0;mso-wrap-distance-right:0;mso-wrap-distance-bottom:0;mso-position-horizontal:absolute;mso-position-horizontal-relative:page;mso-position-vertical:absolute;mso-position-vertical-relative:text;v-text-anchor:top" coordsize="3429000,1270" o:gfxdata="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" path="m,l3429000,e" filled="f" strokecolor="#231f20" strokeweight=".5pt">
                 <v:path arrowok="t"/>
                 <w10:wrap type="topAndBottom" anchorx="page"/>
               </v:shape>
@@ -4358,8 +4391,6 @@
           <w:r>
             <w:rPr>
               <w:rStyle w:val="PageNumber"/>
-              <w:kern w:val="0"/>
-              <w14:ligatures w14:val="none"/>
             </w:rPr>
             <w:fldChar w:fldCharType="begin"/>
           </w:r>
@@ -4374,8 +4405,6 @@
           <w:r>
             <w:rPr>
               <w:rStyle w:val="PageNumber"/>
-              <w:kern w:val="0"/>
-              <w14:ligatures w14:val="none"/>
             </w:rPr>
             <w:fldChar w:fldCharType="separate"/>
           </w:r>
@@ -4391,8 +4420,6 @@
           <w:r>
             <w:rPr>
               <w:rStyle w:val="PageNumber"/>
-              <w:kern w:val="0"/>
-              <w14:ligatures w14:val="none"/>
             </w:rPr>
             <w:fldChar w:fldCharType="end"/>
           </w:r>

</xml_diff>